<commit_message>
feat: add report and diagramm of program algoritm
</commit_message>
<xml_diff>
--- a/Пояснительная_записка_Зайцев (2).docx
+++ b/Пояснительная_записка_Зайцев (2).docx
@@ -49,17 +49,36 @@
     <w:p>
       <w:pPr>
         <w:spacing w:line="240" w:lineRule="auto"/>
+        <w:contextualSpacing/>
         <w:rPr>
           <w:lang w:val="ru-RU"/>
         </w:rPr>
       </w:pPr>
       <w:r>
-        <w:t>Факультет компьютерного проектирования</w:t>
+        <w:t xml:space="preserve">Факультет </w:t>
+      </w:r>
+      <w:proofErr w:type="spellStart"/>
+      <w:r>
+        <w:t>компьюте</w:t>
+      </w:r>
+      <w:r>
+        <w:rPr>
+          <w:lang w:val="ru-RU"/>
+        </w:rPr>
+        <w:t>рных</w:t>
+      </w:r>
+      <w:proofErr w:type="spellEnd"/>
+      <w:r>
+        <w:rPr>
+          <w:lang w:val="ru-RU"/>
+        </w:rPr>
+        <w:t xml:space="preserve"> систем и сетей</w:t>
       </w:r>
     </w:p>
     <w:p>
       <w:pPr>
         <w:spacing w:line="240" w:lineRule="auto"/>
+        <w:contextualSpacing/>
         <w:rPr>
           <w:lang w:val="ru-RU"/>
         </w:rPr>
@@ -68,29 +87,56 @@
     <w:p>
       <w:pPr>
         <w:spacing w:line="240" w:lineRule="auto"/>
-      </w:pPr>
-      <w:r>
-        <w:t xml:space="preserve">Кафедра </w:t>
-      </w:r>
-      <w:r>
+        <w:contextualSpacing/>
         <w:rPr>
           <w:lang w:val="ru-RU"/>
         </w:rPr>
-        <w:t xml:space="preserve">   </w:t>
-      </w:r>
-      <w:r>
-        <w:t>инженерной психологии и эргономики</w:t>
+      </w:pPr>
+      <w:r>
+        <w:t>Кафедра</w:t>
+      </w:r>
+      <w:r>
+        <w:rPr>
+          <w:lang w:val="ru-RU"/>
+        </w:rPr>
+        <w:t xml:space="preserve"> программного обеспечения информационных технологий</w:t>
       </w:r>
     </w:p>
     <w:p>
       <w:pPr>
         <w:spacing w:line="240" w:lineRule="auto"/>
+        <w:contextualSpacing/>
+        <w:rPr>
+          <w:lang w:val="ru-RU"/>
+        </w:rPr>
       </w:pPr>
     </w:p>
     <w:p>
       <w:pPr>
         <w:spacing w:line="240" w:lineRule="auto"/>
-      </w:pPr>
+        <w:contextualSpacing/>
+        <w:rPr>
+          <w:lang w:val="ru-RU"/>
+        </w:rPr>
+      </w:pPr>
+      <w:r>
+        <w:rPr>
+          <w:lang w:val="ru-RU"/>
+        </w:rPr>
+        <w:t>Дисциплина</w:t>
+      </w:r>
+      <w:r>
+        <w:rPr>
+          <w:lang w:val="ru-RU"/>
+        </w:rPr>
+        <w:t xml:space="preserve">: </w:t>
+      </w:r>
+      <w:r>
+        <w:rPr>
+          <w:lang w:val="ru-RU"/>
+        </w:rPr>
+        <w:t>Компьютерные системы и сети</w:t>
+      </w:r>
     </w:p>
     <w:p>
       <w:pPr>
@@ -293,7 +339,7 @@
       </w:r>
       <w:r>
         <w:rPr>
-          <w:lang w:val="en-US"/>
+          <w:lang w:val="ru-RU"/>
         </w:rPr>
         <w:t>15</w:t>
       </w:r>
@@ -1479,7 +1525,7 @@
           <w:noProof/>
         </w:rPr>
         <w:drawing>
-          <wp:anchor distT="0" distB="0" distL="114300" distR="114300" simplePos="0" relativeHeight="251658240" behindDoc="0" locked="0" layoutInCell="1" allowOverlap="1" wp14:anchorId="4438FCC1" wp14:editId="0F6404DC">
+          <wp:anchor distT="0" distB="0" distL="114300" distR="114300" simplePos="0" relativeHeight="251658240" behindDoc="0" locked="0" layoutInCell="1" allowOverlap="1" wp14:anchorId="4438FCC1" wp14:editId="7C70741B">
             <wp:simplePos x="0" y="0"/>
             <wp:positionH relativeFrom="column">
               <wp:posOffset>1905</wp:posOffset>
@@ -3895,7 +3941,16 @@
         </w:rPr>
       </w:pPr>
       <w:r>
-        <w:t>На рисунке 2.1 представлена общая схема архитектуры системы, демонстрирующая взаимодействие между клиентом, сервером и протоколами связи.</w:t>
+        <w:t xml:space="preserve">На </w:t>
+      </w:r>
+      <w:r>
+        <w:rPr>
+          <w:lang w:val="ru-RU"/>
+        </w:rPr>
+        <w:t>схеме алгоритма работы программы (см. Приложение Б)</w:t>
+      </w:r>
+      <w:r>
+        <w:t xml:space="preserve"> представлена общая схема архитектуры системы, демонстрирующая взаимодействие между клиентом, сервером и протоколами связи.</w:t>
       </w:r>
     </w:p>
     <w:p>
@@ -3998,10 +4053,12 @@
         <w:t xml:space="preserve"> через стандартный API </w:t>
       </w:r>
       <w:proofErr w:type="spellStart"/>
+      <w:proofErr w:type="gramStart"/>
       <w:r>
         <w:t>javax.websocket</w:t>
       </w:r>
       <w:proofErr w:type="spellEnd"/>
+      <w:proofErr w:type="gramEnd"/>
       <w:r>
         <w:rPr>
           <w:lang w:val="ru-RU"/>
@@ -4557,6 +4614,7 @@
         <w:t xml:space="preserve">Коллекция активных сессий хранится в </w:t>
       </w:r>
       <w:proofErr w:type="spellStart"/>
+      <w:proofErr w:type="gramStart"/>
       <w:r>
         <w:t>ConcurrentHashMap</w:t>
       </w:r>
@@ -4565,6 +4623,7 @@
         <w:t>&lt;</w:t>
       </w:r>
       <w:proofErr w:type="spellStart"/>
+      <w:proofErr w:type="gramEnd"/>
       <w:r>
         <w:t>String</w:t>
       </w:r>
@@ -4875,7 +4934,15 @@
       </w:r>
       <w:proofErr w:type="spellEnd"/>
       <w:r>
-        <w:t xml:space="preserve">, аннотированным @Scheduled(fixedDelay = 25000). Каждые 25 секунд метод перебирает все открытые </w:t>
+        <w:t>, аннотированным @</w:t>
+      </w:r>
+      <w:proofErr w:type="gramStart"/>
+      <w:r>
+        <w:t>Scheduled(</w:t>
+      </w:r>
+      <w:proofErr w:type="gramEnd"/>
+      <w:r>
+        <w:t xml:space="preserve">fixedDelay = 25000). Каждые 25 секунд метод перебирает все открытые </w:t>
       </w:r>
       <w:proofErr w:type="spellStart"/>
       <w:r>
@@ -5090,7 +5157,15 @@
       </w:r>
       <w:proofErr w:type="spellEnd"/>
       <w:r>
-        <w:t xml:space="preserve">. Аннотация @CrossOrigin("*") разрешает запросы с любых источников. </w:t>
+        <w:t>. Аннотация @</w:t>
+      </w:r>
+      <w:proofErr w:type="gramStart"/>
+      <w:r>
+        <w:t>CrossOrigin(</w:t>
+      </w:r>
+      <w:proofErr w:type="gramEnd"/>
+      <w:r>
+        <w:t xml:space="preserve">"*") разрешает запросы с любых источников. </w:t>
       </w:r>
       <w:proofErr w:type="spellStart"/>
       <w:r>
@@ -5318,6 +5393,7 @@
         <w:t xml:space="preserve">Расчёт допустимых ходов является ключевым алгоритмическим элементом системы. Метод </w:t>
       </w:r>
       <w:proofErr w:type="spellStart"/>
+      <w:proofErr w:type="gramStart"/>
       <w:r>
         <w:t>getValidMoves</w:t>
       </w:r>
@@ -5326,6 +5402,7 @@
         <w:t>(</w:t>
       </w:r>
       <w:proofErr w:type="spellStart"/>
+      <w:proofErr w:type="gramEnd"/>
       <w:r>
         <w:t>PlayerColor</w:t>
       </w:r>
@@ -5350,6 +5427,7 @@
         <w:t xml:space="preserve">Метод </w:t>
       </w:r>
       <w:proofErr w:type="spellStart"/>
+      <w:proofErr w:type="gramStart"/>
       <w:r>
         <w:t>getValidMovesForPiece</w:t>
       </w:r>
@@ -5358,6 +5436,7 @@
         <w:t>(</w:t>
       </w:r>
       <w:proofErr w:type="spellStart"/>
+      <w:proofErr w:type="gramEnd"/>
       <w:r>
         <w:t>Position</w:t>
       </w:r>
@@ -5825,31 +5904,7 @@
             </w:pPr>
             <w:r>
               <w:lastRenderedPageBreak/>
-              <w:t>Board</w:t>
-            </w:r>
-          </w:p>
-        </w:tc>
-        <w:tc>
-          <w:tcPr>
-            <w:tcW w:w="0" w:type="auto"/>
-            <w:tcMar>
-              <w:top w:w="40" w:type="dxa"/>
-              <w:left w:w="80" w:type="dxa"/>
-              <w:bottom w:w="40" w:type="dxa"/>
-              <w:right w:w="80" w:type="dxa"/>
-            </w:tcMar>
-          </w:tcPr>
-          <w:p>
-            <w:pPr>
-              <w:ind w:left="113"/>
-            </w:pPr>
-            <w:proofErr w:type="spellStart"/>
-            <w:r>
-              <w:t>cells</w:t>
-            </w:r>
-            <w:proofErr w:type="spellEnd"/>
-            <w:r>
-              <w:t>[8][8]</w:t>
+              <w:t>Класс</w:t>
             </w:r>
           </w:p>
         </w:tc>
@@ -5868,7 +5923,26 @@
               <w:ind w:left="113"/>
             </w:pPr>
             <w:r>
-              <w:t>Состояние доски и вся игровая логика</w:t>
+              <w:t>Ключевые поля</w:t>
+            </w:r>
+          </w:p>
+        </w:tc>
+        <w:tc>
+          <w:tcPr>
+            <w:tcW w:w="0" w:type="auto"/>
+            <w:tcMar>
+              <w:top w:w="40" w:type="dxa"/>
+              <w:left w:w="80" w:type="dxa"/>
+              <w:bottom w:w="40" w:type="dxa"/>
+              <w:right w:w="80" w:type="dxa"/>
+            </w:tcMar>
+          </w:tcPr>
+          <w:p>
+            <w:pPr>
+              <w:ind w:left="113"/>
+            </w:pPr>
+            <w:r>
+              <w:t>Назначение</w:t>
             </w:r>
           </w:p>
         </w:tc>
@@ -6452,7 +6526,6 @@
         <w:ind w:left="0" w:firstLine="709"/>
       </w:pPr>
       <w:r>
-        <w:lastRenderedPageBreak/>
         <w:t>VALID_MOVES – обновляется список допустимых ходов для отображения подсветки;</w:t>
       </w:r>
     </w:p>
@@ -6466,6 +6539,7 @@
         <w:ind w:left="0" w:firstLine="709"/>
       </w:pPr>
       <w:r>
+        <w:lastRenderedPageBreak/>
         <w:t>GAME_OVER – сохраняется победитель и причина окончания; воспроизводятся звуки победы или поражения;</w:t>
       </w:r>
     </w:p>
@@ -8905,6 +8979,491 @@
     <w:p>
       <w:pPr>
         <w:ind w:firstLine="709"/>
+        <w:rPr>
+          <w:lang w:val="ru-RU"/>
+        </w:rPr>
+      </w:pPr>
+      <w:r>
+        <w:rPr>
+          <w:noProof/>
+          <w:lang w:val="ru-RU"/>
+        </w:rPr>
+        <w:drawing>
+          <wp:anchor distT="0" distB="0" distL="114300" distR="114300" simplePos="0" relativeHeight="251669504" behindDoc="0" locked="0" layoutInCell="1" allowOverlap="1" wp14:anchorId="5B90FEC5" wp14:editId="77F46F7F">
+            <wp:simplePos x="0" y="0"/>
+            <wp:positionH relativeFrom="column">
+              <wp:posOffset>-3810</wp:posOffset>
+            </wp:positionH>
+            <wp:positionV relativeFrom="paragraph">
+              <wp:posOffset>520700</wp:posOffset>
+            </wp:positionV>
+            <wp:extent cx="5939790" cy="269240"/>
+            <wp:effectExtent l="0" t="0" r="3810" b="0"/>
+            <wp:wrapTopAndBottom/>
+            <wp:docPr id="841288952" name="Рисунок 1"/>
+            <wp:cNvGraphicFramePr>
+              <a:graphicFrameLocks xmlns:a="http://schemas.openxmlformats.org/drawingml/2006/main" noChangeAspect="1"/>
+            </wp:cNvGraphicFramePr>
+            <a:graphic xmlns:a="http://schemas.openxmlformats.org/drawingml/2006/main">
+              <a:graphicData uri="http://schemas.openxmlformats.org/drawingml/2006/picture">
+                <pic:pic xmlns:pic="http://schemas.openxmlformats.org/drawingml/2006/picture">
+                  <pic:nvPicPr>
+                    <pic:cNvPr id="841288952" name=""/>
+                    <pic:cNvPicPr/>
+                  </pic:nvPicPr>
+                  <pic:blipFill>
+                    <a:blip r:embed="rId13">
+                      <a:extLst>
+                        <a:ext uri="{28A0092B-C50C-407E-A947-70E740481C1C}">
+                          <a14:useLocalDpi xmlns:a14="http://schemas.microsoft.com/office/drawing/2010/main" val="0"/>
+                        </a:ext>
+                      </a:extLst>
+                    </a:blip>
+                    <a:stretch>
+                      <a:fillRect/>
+                    </a:stretch>
+                  </pic:blipFill>
+                  <pic:spPr>
+                    <a:xfrm>
+                      <a:off x="0" y="0"/>
+                      <a:ext cx="5939790" cy="269240"/>
+                    </a:xfrm>
+                    <a:prstGeom prst="rect">
+                      <a:avLst/>
+                    </a:prstGeom>
+                  </pic:spPr>
+                </pic:pic>
+              </a:graphicData>
+            </a:graphic>
+          </wp:anchor>
+        </w:drawing>
+      </w:r>
+      <w:r>
+        <w:rPr>
+          <w:lang w:val="ru-RU"/>
+        </w:rPr>
+        <w:t xml:space="preserve">Также было проведено отслеживание пакетов в </w:t>
+      </w:r>
+      <w:r>
+        <w:rPr>
+          <w:lang w:val="en-US"/>
+        </w:rPr>
+        <w:t>Wireshark</w:t>
+      </w:r>
+      <w:r>
+        <w:rPr>
+          <w:lang w:val="ru-RU"/>
+        </w:rPr>
+        <w:t>.</w:t>
+      </w:r>
+      <w:r>
+        <w:rPr>
+          <w:lang w:val="ru-RU"/>
+        </w:rPr>
+        <w:t xml:space="preserve"> Результат для </w:t>
+      </w:r>
+      <w:r>
+        <w:rPr>
+          <w:lang w:val="en-US"/>
+        </w:rPr>
+        <w:t>HTTP</w:t>
+      </w:r>
+      <w:r>
+        <w:rPr>
+          <w:lang w:val="ru-RU"/>
+        </w:rPr>
+        <w:t xml:space="preserve">-запроса </w:t>
+      </w:r>
+      <w:r>
+        <w:rPr>
+          <w:lang w:val="ru-RU"/>
+        </w:rPr>
+        <w:t>/</w:t>
+      </w:r>
+      <w:proofErr w:type="spellStart"/>
+      <w:r>
+        <w:rPr>
+          <w:lang w:val="en-US"/>
+        </w:rPr>
+        <w:t>api</w:t>
+      </w:r>
+      <w:proofErr w:type="spellEnd"/>
+      <w:r>
+        <w:rPr>
+          <w:lang w:val="ru-RU"/>
+        </w:rPr>
+        <w:t>/</w:t>
+      </w:r>
+      <w:r>
+        <w:rPr>
+          <w:lang w:val="en-US"/>
+        </w:rPr>
+        <w:t>games</w:t>
+      </w:r>
+      <w:r>
+        <w:rPr>
+          <w:lang w:val="ru-RU"/>
+        </w:rPr>
+        <w:t xml:space="preserve"> </w:t>
+      </w:r>
+      <w:r>
+        <w:rPr>
+          <w:lang w:val="ru-RU"/>
+        </w:rPr>
+        <w:t>представлен на рисунке 4.2</w:t>
+      </w:r>
+      <w:r>
+        <w:rPr>
+          <w:lang w:val="ru-RU"/>
+        </w:rPr>
+        <w:t>.</w:t>
+      </w:r>
+    </w:p>
+    <w:p>
+      <w:pPr>
+        <w:ind w:firstLine="709"/>
+        <w:rPr>
+          <w:lang w:val="ru-RU"/>
+        </w:rPr>
+      </w:pPr>
+      <w:r>
+        <w:rPr>
+          <w:lang w:val="ru-RU"/>
+        </w:rPr>
+        <w:t xml:space="preserve"> </w:t>
+      </w:r>
+    </w:p>
+    <w:p>
+      <w:pPr>
+        <w:jc w:val="center"/>
+        <w:rPr>
+          <w:lang w:val="ru-RU"/>
+        </w:rPr>
+      </w:pPr>
+      <w:r>
+        <w:t>Рисунок 4.2 – HTTP-</w:t>
+      </w:r>
+      <w:r>
+        <w:rPr>
+          <w:lang w:val="ru-RU"/>
+        </w:rPr>
+        <w:t xml:space="preserve">запрос и </w:t>
+      </w:r>
+      <w:r>
+        <w:rPr>
+          <w:lang w:val="en-US"/>
+        </w:rPr>
+        <w:t>HTTP</w:t>
+      </w:r>
+      <w:r>
+        <w:rPr>
+          <w:lang w:val="ru-RU"/>
+        </w:rPr>
+        <w:t>-</w:t>
+      </w:r>
+      <w:r>
+        <w:rPr>
+          <w:lang w:val="ru-RU"/>
+        </w:rPr>
+        <w:t>ответ</w:t>
+      </w:r>
+    </w:p>
+    <w:p>
+      <w:pPr>
+        <w:jc w:val="center"/>
+        <w:rPr>
+          <w:lang w:val="ru-RU"/>
+        </w:rPr>
+      </w:pPr>
+    </w:p>
+    <w:p>
+      <w:pPr>
+        <w:rPr>
+          <w:lang w:val="ru-RU"/>
+        </w:rPr>
+      </w:pPr>
+      <w:r>
+        <w:rPr>
+          <w:lang w:val="ru-RU"/>
+        </w:rPr>
+        <w:tab/>
+      </w:r>
+      <w:r>
+        <w:rPr>
+          <w:lang w:val="ru-RU"/>
+        </w:rPr>
+        <w:t xml:space="preserve">На рисунке 4.3 представлен пакет, который является примером, как по протоколу </w:t>
+      </w:r>
+      <w:r>
+        <w:rPr>
+          <w:lang w:val="en-US"/>
+        </w:rPr>
+        <w:t>WebSocket</w:t>
+      </w:r>
+      <w:r>
+        <w:rPr>
+          <w:lang w:val="ru-RU"/>
+        </w:rPr>
+        <w:t xml:space="preserve"> </w:t>
+      </w:r>
+      <w:r>
+        <w:rPr>
+          <w:lang w:val="ru-RU"/>
+        </w:rPr>
+        <w:t>передается текущее состояние игры.</w:t>
+      </w:r>
+    </w:p>
+    <w:p>
+      <w:pPr>
+        <w:jc w:val="left"/>
+        <w:rPr>
+          <w:lang w:val="ru-RU"/>
+        </w:rPr>
+      </w:pPr>
+      <w:r>
+        <w:rPr>
+          <w:noProof/>
+          <w:lang w:val="ru-RU"/>
+        </w:rPr>
+        <w:drawing>
+          <wp:inline distT="0" distB="0" distL="0" distR="0" wp14:anchorId="04155CBC" wp14:editId="13CC68F5">
+            <wp:extent cx="5939790" cy="115570"/>
+            <wp:effectExtent l="0" t="0" r="3810" b="0"/>
+            <wp:docPr id="83508072" name="Рисунок 1"/>
+            <wp:cNvGraphicFramePr>
+              <a:graphicFrameLocks xmlns:a="http://schemas.openxmlformats.org/drawingml/2006/main" noChangeAspect="1"/>
+            </wp:cNvGraphicFramePr>
+            <a:graphic xmlns:a="http://schemas.openxmlformats.org/drawingml/2006/main">
+              <a:graphicData uri="http://schemas.openxmlformats.org/drawingml/2006/picture">
+                <pic:pic xmlns:pic="http://schemas.openxmlformats.org/drawingml/2006/picture">
+                  <pic:nvPicPr>
+                    <pic:cNvPr id="83508072" name=""/>
+                    <pic:cNvPicPr/>
+                  </pic:nvPicPr>
+                  <pic:blipFill>
+                    <a:blip r:embed="rId14"/>
+                    <a:stretch>
+                      <a:fillRect/>
+                    </a:stretch>
+                  </pic:blipFill>
+                  <pic:spPr>
+                    <a:xfrm>
+                      <a:off x="0" y="0"/>
+                      <a:ext cx="5939790" cy="115570"/>
+                    </a:xfrm>
+                    <a:prstGeom prst="rect">
+                      <a:avLst/>
+                    </a:prstGeom>
+                  </pic:spPr>
+                </pic:pic>
+              </a:graphicData>
+            </a:graphic>
+          </wp:inline>
+        </w:drawing>
+      </w:r>
+    </w:p>
+    <w:p>
+      <w:pPr>
+        <w:ind w:firstLine="709"/>
+        <w:rPr>
+          <w:lang w:val="ru-RU"/>
+        </w:rPr>
+      </w:pPr>
+    </w:p>
+    <w:p>
+      <w:pPr>
+        <w:ind w:firstLine="709"/>
+        <w:jc w:val="center"/>
+        <w:rPr>
+          <w:lang w:val="ru-RU"/>
+        </w:rPr>
+      </w:pPr>
+      <w:r>
+        <w:t>Рисунок 4.</w:t>
+      </w:r>
+      <w:r>
+        <w:rPr>
+          <w:lang w:val="ru-RU"/>
+        </w:rPr>
+        <w:t>3</w:t>
+      </w:r>
+      <w:r>
+        <w:t xml:space="preserve"> – </w:t>
+      </w:r>
+      <w:r>
+        <w:rPr>
+          <w:lang w:val="en-US"/>
+        </w:rPr>
+        <w:t>WebSocket</w:t>
+      </w:r>
+      <w:r>
+        <w:rPr>
+          <w:lang w:val="ru-RU"/>
+        </w:rPr>
+        <w:t xml:space="preserve"> </w:t>
+      </w:r>
+      <w:r>
+        <w:rPr>
+          <w:lang w:val="ru-RU"/>
+        </w:rPr>
+        <w:t>передача данных</w:t>
+      </w:r>
+    </w:p>
+    <w:p>
+      <w:pPr>
+        <w:ind w:firstLine="709"/>
+        <w:jc w:val="center"/>
+        <w:rPr>
+          <w:lang w:val="ru-RU"/>
+        </w:rPr>
+      </w:pPr>
+    </w:p>
+    <w:p>
+      <w:pPr>
+        <w:ind w:firstLine="709"/>
+        <w:rPr>
+          <w:lang w:val="ru-RU"/>
+        </w:rPr>
+      </w:pPr>
+      <w:r>
+        <w:rPr>
+          <w:lang w:val="ru-RU"/>
+        </w:rPr>
+        <w:t xml:space="preserve">Также на рисунке 4.4 представлена полезная нагрузка данного </w:t>
+      </w:r>
+      <w:r>
+        <w:rPr>
+          <w:lang w:val="en-US"/>
+        </w:rPr>
+        <w:t>WebSocket</w:t>
+      </w:r>
+      <w:r>
+        <w:rPr>
+          <w:lang w:val="ru-RU"/>
+        </w:rPr>
+        <w:t>-</w:t>
+      </w:r>
+      <w:r>
+        <w:rPr>
+          <w:lang w:val="ru-RU"/>
+        </w:rPr>
+        <w:t>пакета.</w:t>
+      </w:r>
+    </w:p>
+    <w:p>
+      <w:pPr>
+        <w:ind w:firstLine="709"/>
+        <w:rPr>
+          <w:lang w:val="ru-RU"/>
+        </w:rPr>
+      </w:pPr>
+      <w:r>
+        <w:rPr>
+          <w:noProof/>
+          <w:lang w:val="ru-RU"/>
+        </w:rPr>
+        <w:drawing>
+          <wp:anchor distT="0" distB="0" distL="114300" distR="114300" simplePos="0" relativeHeight="251670528" behindDoc="0" locked="0" layoutInCell="1" allowOverlap="1" wp14:anchorId="4F5E4C9E" wp14:editId="500DCBAB">
+            <wp:simplePos x="0" y="0"/>
+            <wp:positionH relativeFrom="column">
+              <wp:posOffset>2044065</wp:posOffset>
+            </wp:positionH>
+            <wp:positionV relativeFrom="paragraph">
+              <wp:posOffset>252095</wp:posOffset>
+            </wp:positionV>
+            <wp:extent cx="2009775" cy="1476375"/>
+            <wp:effectExtent l="0" t="0" r="9525" b="9525"/>
+            <wp:wrapTopAndBottom/>
+            <wp:docPr id="1710546581" name="Рисунок 1"/>
+            <wp:cNvGraphicFramePr>
+              <a:graphicFrameLocks xmlns:a="http://schemas.openxmlformats.org/drawingml/2006/main" noChangeAspect="1"/>
+            </wp:cNvGraphicFramePr>
+            <a:graphic xmlns:a="http://schemas.openxmlformats.org/drawingml/2006/main">
+              <a:graphicData uri="http://schemas.openxmlformats.org/drawingml/2006/picture">
+                <pic:pic xmlns:pic="http://schemas.openxmlformats.org/drawingml/2006/picture">
+                  <pic:nvPicPr>
+                    <pic:cNvPr id="1710546581" name=""/>
+                    <pic:cNvPicPr/>
+                  </pic:nvPicPr>
+                  <pic:blipFill>
+                    <a:blip r:embed="rId15">
+                      <a:extLst>
+                        <a:ext uri="{28A0092B-C50C-407E-A947-70E740481C1C}">
+                          <a14:useLocalDpi xmlns:a14="http://schemas.microsoft.com/office/drawing/2010/main" val="0"/>
+                        </a:ext>
+                      </a:extLst>
+                    </a:blip>
+                    <a:stretch>
+                      <a:fillRect/>
+                    </a:stretch>
+                  </pic:blipFill>
+                  <pic:spPr>
+                    <a:xfrm>
+                      <a:off x="0" y="0"/>
+                      <a:ext cx="2009775" cy="1476375"/>
+                    </a:xfrm>
+                    <a:prstGeom prst="rect">
+                      <a:avLst/>
+                    </a:prstGeom>
+                  </pic:spPr>
+                </pic:pic>
+              </a:graphicData>
+            </a:graphic>
+          </wp:anchor>
+        </w:drawing>
+      </w:r>
+    </w:p>
+    <w:p>
+      <w:pPr>
+        <w:ind w:firstLine="709"/>
+        <w:jc w:val="center"/>
+      </w:pPr>
+    </w:p>
+    <w:p>
+      <w:pPr>
+        <w:ind w:firstLine="709"/>
+        <w:jc w:val="center"/>
+        <w:rPr>
+          <w:lang w:val="ru-RU"/>
+        </w:rPr>
+      </w:pPr>
+      <w:r>
+        <w:t>Рисунок 4.</w:t>
+      </w:r>
+      <w:r>
+        <w:rPr>
+          <w:lang w:val="ru-RU"/>
+        </w:rPr>
+        <w:t>4</w:t>
+      </w:r>
+      <w:r>
+        <w:t xml:space="preserve"> – </w:t>
+      </w:r>
+      <w:r>
+        <w:rPr>
+          <w:lang w:val="ru-RU"/>
+        </w:rPr>
+        <w:t xml:space="preserve">Полезная нагрузка пакета </w:t>
+      </w:r>
+      <w:r>
+        <w:rPr>
+          <w:lang w:val="en-US"/>
+        </w:rPr>
+        <w:t>WebSocket</w:t>
+      </w:r>
+    </w:p>
+    <w:p>
+      <w:pPr>
+        <w:ind w:firstLine="709"/>
+        <w:jc w:val="center"/>
+        <w:rPr>
+          <w:lang w:val="ru-RU"/>
+        </w:rPr>
+      </w:pPr>
+    </w:p>
+    <w:p>
+      <w:pPr>
+        <w:ind w:firstLine="709"/>
       </w:pPr>
       <w:r>
         <w:t xml:space="preserve">Дополнительно проведено тестирование совместимости с браузерами. Приложение корректно функционирует во всех протестированных браузерах: Google </w:t>
@@ -9054,7 +9613,7 @@
                     <pic:cNvPicPr/>
                   </pic:nvPicPr>
                   <pic:blipFill>
-                    <a:blip r:embed="rId13" cstate="print">
+                    <a:blip r:embed="rId16" cstate="print">
                       <a:extLst>
                         <a:ext uri="{28A0092B-C50C-407E-A947-70E740481C1C}">
                           <a14:useLocalDpi xmlns:a14="http://schemas.microsoft.com/office/drawing/2010/main" val="0"/>
@@ -9152,7 +9711,7 @@
           <w:noProof/>
         </w:rPr>
         <w:drawing>
-          <wp:anchor distT="0" distB="0" distL="114300" distR="114300" simplePos="0" relativeHeight="251666432" behindDoc="0" locked="0" layoutInCell="1" allowOverlap="1" wp14:anchorId="31A0325C" wp14:editId="1A1E16F9">
+          <wp:anchor distT="0" distB="0" distL="114300" distR="114300" simplePos="0" relativeHeight="251666432" behindDoc="0" locked="0" layoutInCell="1" allowOverlap="1" wp14:anchorId="31A0325C" wp14:editId="0CD5AD92">
             <wp:simplePos x="0" y="0"/>
             <wp:positionH relativeFrom="column">
               <wp:posOffset>1905</wp:posOffset>
@@ -9175,7 +9734,7 @@
                     <pic:cNvPicPr/>
                   </pic:nvPicPr>
                   <pic:blipFill>
-                    <a:blip r:embed="rId14" cstate="print">
+                    <a:blip r:embed="rId17" cstate="print">
                       <a:extLst>
                         <a:ext uri="{28A0092B-C50C-407E-A947-70E740481C1C}">
                           <a14:useLocalDpi xmlns:a14="http://schemas.microsoft.com/office/drawing/2010/main" val="0"/>
@@ -9428,7 +9987,7 @@
         </w:rPr>
         <w:lastRenderedPageBreak/>
         <w:drawing>
-          <wp:anchor distT="0" distB="0" distL="114300" distR="114300" simplePos="0" relativeHeight="251667456" behindDoc="0" locked="0" layoutInCell="1" allowOverlap="1" wp14:anchorId="5EB8AC2C" wp14:editId="3E8547BE">
+          <wp:anchor distT="0" distB="0" distL="114300" distR="114300" simplePos="0" relativeHeight="251667456" behindDoc="0" locked="0" layoutInCell="1" allowOverlap="1" wp14:anchorId="5EB8AC2C" wp14:editId="37BA9AE9">
             <wp:simplePos x="0" y="0"/>
             <wp:positionH relativeFrom="column">
               <wp:posOffset>17145</wp:posOffset>
@@ -9451,7 +10010,7 @@
                     <pic:cNvPicPr/>
                   </pic:nvPicPr>
                   <pic:blipFill>
-                    <a:blip r:embed="rId15" cstate="print">
+                    <a:blip r:embed="rId18" cstate="print">
                       <a:extLst>
                         <a:ext uri="{28A0092B-C50C-407E-A947-70E740481C1C}">
                           <a14:useLocalDpi xmlns:a14="http://schemas.microsoft.com/office/drawing/2010/main" val="0"/>
@@ -9575,7 +10134,7 @@
                     <pic:cNvPicPr/>
                   </pic:nvPicPr>
                   <pic:blipFill>
-                    <a:blip r:embed="rId16" cstate="print">
+                    <a:blip r:embed="rId19" cstate="print">
                       <a:extLst>
                         <a:ext uri="{28A0092B-C50C-407E-A947-70E740481C1C}">
                           <a14:useLocalDpi xmlns:a14="http://schemas.microsoft.com/office/drawing/2010/main" val="0"/>
@@ -9878,7 +10437,7 @@
       <w:r>
         <w:t xml:space="preserve">: RFC 6455 [Электронный ресурс]. – Режим доступа: </w:t>
       </w:r>
-      <w:hyperlink r:id="rId17" w:history="1">
+      <w:hyperlink r:id="rId20" w:history="1">
         <w:r>
           <w:rPr>
             <w:rStyle w:val="a5"/>
@@ -9944,7 +10503,7 @@
       <w:r>
         <w:t xml:space="preserve"> </w:t>
       </w:r>
-      <w:hyperlink r:id="rId18" w:history="1">
+      <w:hyperlink r:id="rId21" w:history="1">
         <w:r>
           <w:rPr>
             <w:rStyle w:val="a5"/>
@@ -9977,7 +10536,7 @@
       <w:r>
         <w:t xml:space="preserve"> – игры онлайн [Электронный ресурс]. – Режим доступа: </w:t>
       </w:r>
-      <w:hyperlink r:id="rId19" w:history="1">
+      <w:hyperlink r:id="rId22" w:history="1">
         <w:r>
           <w:rPr>
             <w:rStyle w:val="a5"/>
@@ -10007,7 +10566,7 @@
       <w:r>
         <w:t xml:space="preserve"> – свободная шашечная платформа [Электронный ресурс]. – Режим доступа: </w:t>
       </w:r>
-      <w:hyperlink r:id="rId20" w:history="1">
+      <w:hyperlink r:id="rId23" w:history="1">
         <w:r>
           <w:rPr>
             <w:rStyle w:val="a5"/>
@@ -10043,7 +10602,7 @@
       <w:r>
         <w:t xml:space="preserve"> – играть в шашки онлайн [Электронный ресурс]. – Режим доступа: </w:t>
       </w:r>
-      <w:hyperlink r:id="rId21" w:history="1">
+      <w:hyperlink r:id="rId24" w:history="1">
         <w:r>
           <w:rPr>
             <w:rStyle w:val="a5"/>
@@ -10060,13 +10619,7 @@
         <w:ind w:firstLine="709"/>
       </w:pPr>
       <w:r>
-        <w:t>[</w:t>
-      </w:r>
-      <w:r>
-        <w:t>6</w:t>
-      </w:r>
-      <w:r>
-        <w:t>]</w:t>
+        <w:t>[6]</w:t>
       </w:r>
       <w:r>
         <w:rPr>
@@ -10100,7 +10653,7 @@
         </w:rPr>
         <w:t xml:space="preserve"> </w:t>
       </w:r>
-      <w:hyperlink r:id="rId22" w:history="1">
+      <w:hyperlink r:id="rId25" w:history="1">
         <w:r>
           <w:rPr>
             <w:rStyle w:val="a5"/>
@@ -10118,13 +10671,7 @@
         <w:ind w:firstLine="709"/>
       </w:pPr>
       <w:r>
-        <w:t>[</w:t>
-      </w:r>
-      <w:r>
-        <w:t>7</w:t>
-      </w:r>
-      <w:r>
-        <w:t>]</w:t>
+        <w:t>[7]</w:t>
       </w:r>
       <w:r>
         <w:rPr>
@@ -10156,7 +10703,7 @@
       <w:r>
         <w:t xml:space="preserve">[Электронный ресурс]. – Режим доступа: </w:t>
       </w:r>
-      <w:hyperlink r:id="rId23" w:history="1">
+      <w:hyperlink r:id="rId26" w:history="1">
         <w:r>
           <w:rPr>
             <w:rStyle w:val="a5"/>
@@ -10173,13 +10720,7 @@
         <w:ind w:firstLine="709"/>
       </w:pPr>
       <w:r>
-        <w:t>[</w:t>
-      </w:r>
-      <w:r>
-        <w:t>8</w:t>
-      </w:r>
-      <w:r>
-        <w:t>]</w:t>
+        <w:t>[8]</w:t>
       </w:r>
       <w:r>
         <w:rPr>
@@ -10201,7 +10742,7 @@
       <w:r>
         <w:t xml:space="preserve">[Электронный ресурс]. – Режим доступа: </w:t>
       </w:r>
-      <w:hyperlink r:id="rId24" w:history="1">
+      <w:hyperlink r:id="rId27" w:history="1">
         <w:r>
           <w:rPr>
             <w:rStyle w:val="a5"/>
@@ -10276,7 +10817,7 @@
       <w:r>
         <w:t xml:space="preserve">[Электронный ресурс]. – Режим доступа: </w:t>
       </w:r>
-      <w:hyperlink r:id="rId25" w:history="1">
+      <w:hyperlink r:id="rId28" w:history="1">
         <w:r>
           <w:rPr>
             <w:rStyle w:val="a5"/>
@@ -10328,14 +10869,19 @@
         <w:t xml:space="preserve"> – </w:t>
       </w:r>
       <w:proofErr w:type="spellStart"/>
+      <w:proofErr w:type="gramStart"/>
       <w:r>
         <w:t>React.dev</w:t>
       </w:r>
       <w:proofErr w:type="spellEnd"/>
       <w:r>
-        <w:t xml:space="preserve">[Электронный ресурс]. – Режим доступа: </w:t>
-      </w:r>
-      <w:hyperlink r:id="rId26" w:history="1">
+        <w:t>[</w:t>
+      </w:r>
+      <w:proofErr w:type="gramEnd"/>
+      <w:r>
+        <w:t xml:space="preserve">Электронный ресурс]. – Режим доступа: </w:t>
+      </w:r>
+      <w:hyperlink r:id="rId29" w:history="1">
         <w:r>
           <w:rPr>
             <w:rStyle w:val="a5"/>
@@ -10352,13 +10898,7 @@
         <w:ind w:firstLine="709"/>
       </w:pPr>
       <w:r>
-        <w:t>[1</w:t>
-      </w:r>
-      <w:r>
-        <w:t>1</w:t>
-      </w:r>
-      <w:r>
-        <w:t>]</w:t>
+        <w:t>[11]</w:t>
       </w:r>
       <w:r>
         <w:rPr>
@@ -10385,7 +10925,7 @@
       <w:r>
         <w:t xml:space="preserve"> [Электронный ресурс]. – Режим доступа: </w:t>
       </w:r>
-      <w:hyperlink r:id="rId27" w:history="1">
+      <w:hyperlink r:id="rId30" w:history="1">
         <w:r>
           <w:rPr>
             <w:rStyle w:val="a5"/>
@@ -10402,13 +10942,7 @@
         <w:ind w:firstLine="709"/>
       </w:pPr>
       <w:r>
-        <w:t>[1</w:t>
-      </w:r>
-      <w:r>
-        <w:t>2</w:t>
-      </w:r>
-      <w:r>
-        <w:t>]</w:t>
+        <w:t>[12]</w:t>
       </w:r>
       <w:r>
         <w:rPr>
@@ -10424,7 +10958,7 @@
       <w:r>
         <w:t xml:space="preserve"> – инструмент сборки [Электронный ресурс]. – Режим доступа: </w:t>
       </w:r>
-      <w:hyperlink r:id="rId28" w:history="1">
+      <w:hyperlink r:id="rId31" w:history="1">
         <w:r>
           <w:rPr>
             <w:rStyle w:val="a5"/>
@@ -10441,13 +10975,7 @@
         <w:ind w:firstLine="709"/>
       </w:pPr>
       <w:r>
-        <w:t>[1</w:t>
-      </w:r>
-      <w:r>
-        <w:t>3</w:t>
-      </w:r>
-      <w:r>
-        <w:t>]</w:t>
+        <w:t>[13]</w:t>
       </w:r>
       <w:r>
         <w:rPr>
@@ -10463,7 +10991,7 @@
       <w:r>
         <w:t xml:space="preserve"> – платформа контейнеризации [Электронный ресурс]. – Режим доступа: </w:t>
       </w:r>
-      <w:hyperlink r:id="rId29" w:history="1">
+      <w:hyperlink r:id="rId32" w:history="1">
         <w:r>
           <w:rPr>
             <w:rStyle w:val="a5"/>
@@ -10505,7 +11033,7 @@
         </w:rPr>
         <w:t xml:space="preserve"> </w:t>
       </w:r>
-      <w:hyperlink r:id="rId30" w:history="1">
+      <w:hyperlink r:id="rId33" w:history="1">
         <w:r>
           <w:rPr>
             <w:rStyle w:val="a5"/>
@@ -10581,7 +11109,7 @@
       <w:r>
         <w:t xml:space="preserve">[Электронный ресурс]. – Режим доступа: </w:t>
       </w:r>
-      <w:hyperlink r:id="rId31" w:history="1">
+      <w:hyperlink r:id="rId34" w:history="1">
         <w:r>
           <w:rPr>
             <w:rStyle w:val="a5"/>
@@ -14379,6 +14907,7 @@
         <w:t xml:space="preserve"> </w:t>
       </w:r>
       <w:proofErr w:type="spellStart"/>
+      <w:proofErr w:type="gramStart"/>
       <w:r>
         <w:rPr>
           <w:rFonts w:ascii="Courier New" w:hAnsi="Courier New" w:cs="Courier New"/>
@@ -14397,6 +14926,7 @@
         <w:t>(</w:t>
       </w:r>
       <w:proofErr w:type="spellStart"/>
+      <w:proofErr w:type="gramEnd"/>
       <w:r>
         <w:rPr>
           <w:rFonts w:ascii="Courier New" w:hAnsi="Courier New" w:cs="Courier New"/>
@@ -14533,6 +15063,7 @@
         <w:t xml:space="preserve"> </w:t>
       </w:r>
       <w:proofErr w:type="spellStart"/>
+      <w:proofErr w:type="gramStart"/>
       <w:r>
         <w:rPr>
           <w:rFonts w:ascii="Courier New" w:hAnsi="Courier New" w:cs="Courier New"/>
@@ -14551,6 +15082,7 @@
         <w:t>(</w:t>
       </w:r>
       <w:proofErr w:type="spellStart"/>
+      <w:proofErr w:type="gramEnd"/>
       <w:r>
         <w:rPr>
           <w:rFonts w:ascii="Courier New" w:hAnsi="Courier New" w:cs="Courier New"/>
@@ -14713,6 +15245,7 @@
         <w:t xml:space="preserve"> = </w:t>
       </w:r>
       <w:proofErr w:type="spellStart"/>
+      <w:proofErr w:type="gramStart"/>
       <w:r>
         <w:rPr>
           <w:rFonts w:ascii="Courier New" w:hAnsi="Courier New" w:cs="Courier New"/>
@@ -14722,6 +15255,7 @@
         <w:t>gson.fromJson</w:t>
       </w:r>
       <w:proofErr w:type="spellEnd"/>
+      <w:proofErr w:type="gramEnd"/>
       <w:r>
         <w:rPr>
           <w:rFonts w:ascii="Courier New" w:hAnsi="Courier New" w:cs="Courier New"/>
@@ -14731,6 +15265,7 @@
         <w:t>(</w:t>
       </w:r>
       <w:proofErr w:type="spellStart"/>
+      <w:proofErr w:type="gramStart"/>
       <w:r>
         <w:rPr>
           <w:rFonts w:ascii="Courier New" w:hAnsi="Courier New" w:cs="Courier New"/>
@@ -14740,6 +15275,7 @@
         <w:t>message.getPayload</w:t>
       </w:r>
       <w:proofErr w:type="spellEnd"/>
+      <w:proofErr w:type="gramEnd"/>
       <w:r>
         <w:rPr>
           <w:rFonts w:ascii="Courier New" w:hAnsi="Courier New" w:cs="Courier New"/>
@@ -14813,6 +15349,7 @@
         <w:t xml:space="preserve"> (</w:t>
       </w:r>
       <w:proofErr w:type="spellStart"/>
+      <w:proofErr w:type="gramStart"/>
       <w:r>
         <w:rPr>
           <w:rFonts w:ascii="Courier New" w:hAnsi="Courier New" w:cs="Courier New"/>
@@ -14822,6 +15359,7 @@
         <w:t>msg.getType</w:t>
       </w:r>
       <w:proofErr w:type="spellEnd"/>
+      <w:proofErr w:type="gramEnd"/>
       <w:r>
         <w:rPr>
           <w:rFonts w:ascii="Courier New" w:hAnsi="Courier New" w:cs="Courier New"/>
@@ -14867,6 +15405,7 @@
         <w:t xml:space="preserve"> "CREATE_GAME"     -&gt; </w:t>
       </w:r>
       <w:proofErr w:type="spellStart"/>
+      <w:proofErr w:type="gramStart"/>
       <w:r>
         <w:rPr>
           <w:rFonts w:ascii="Courier New" w:hAnsi="Courier New" w:cs="Courier New"/>
@@ -14885,6 +15424,7 @@
         <w:t>(</w:t>
       </w:r>
       <w:proofErr w:type="spellStart"/>
+      <w:proofErr w:type="gramEnd"/>
       <w:r>
         <w:rPr>
           <w:rFonts w:ascii="Courier New" w:hAnsi="Courier New" w:cs="Courier New"/>
@@ -14957,6 +15497,7 @@
         <w:t xml:space="preserve"> "JOIN_GAME"       -&gt; </w:t>
       </w:r>
       <w:proofErr w:type="spellStart"/>
+      <w:proofErr w:type="gramStart"/>
       <w:r>
         <w:rPr>
           <w:rFonts w:ascii="Courier New" w:hAnsi="Courier New" w:cs="Courier New"/>
@@ -14975,6 +15516,7 @@
         <w:t>(</w:t>
       </w:r>
       <w:proofErr w:type="spellStart"/>
+      <w:proofErr w:type="gramEnd"/>
       <w:r>
         <w:rPr>
           <w:rFonts w:ascii="Courier New" w:hAnsi="Courier New" w:cs="Courier New"/>
@@ -15047,6 +15589,7 @@
         <w:t xml:space="preserve"> "QUICK_JOIN"      -&gt; </w:t>
       </w:r>
       <w:proofErr w:type="spellStart"/>
+      <w:proofErr w:type="gramStart"/>
       <w:r>
         <w:rPr>
           <w:rFonts w:ascii="Courier New" w:hAnsi="Courier New" w:cs="Courier New"/>
@@ -15065,6 +15608,7 @@
         <w:t>(</w:t>
       </w:r>
       <w:proofErr w:type="spellStart"/>
+      <w:proofErr w:type="gramEnd"/>
       <w:r>
         <w:rPr>
           <w:rFonts w:ascii="Courier New" w:hAnsi="Courier New" w:cs="Courier New"/>
@@ -15138,6 +15682,7 @@
         <w:t xml:space="preserve"> "MAKE_MOVE"       -&gt; </w:t>
       </w:r>
       <w:proofErr w:type="spellStart"/>
+      <w:proofErr w:type="gramStart"/>
       <w:r>
         <w:rPr>
           <w:rFonts w:ascii="Courier New" w:hAnsi="Courier New" w:cs="Courier New"/>
@@ -15156,6 +15701,7 @@
         <w:t>(</w:t>
       </w:r>
       <w:proofErr w:type="spellStart"/>
+      <w:proofErr w:type="gramEnd"/>
       <w:r>
         <w:rPr>
           <w:rFonts w:ascii="Courier New" w:hAnsi="Courier New" w:cs="Courier New"/>
@@ -15228,6 +15774,7 @@
         <w:t xml:space="preserve"> "GET_VALID_MOVES" -&gt; </w:t>
       </w:r>
       <w:proofErr w:type="spellStart"/>
+      <w:proofErr w:type="gramStart"/>
       <w:r>
         <w:rPr>
           <w:rFonts w:ascii="Courier New" w:hAnsi="Courier New" w:cs="Courier New"/>
@@ -15246,6 +15793,7 @@
         <w:t>(</w:t>
       </w:r>
       <w:proofErr w:type="spellStart"/>
+      <w:proofErr w:type="gramEnd"/>
       <w:r>
         <w:rPr>
           <w:rFonts w:ascii="Courier New" w:hAnsi="Courier New" w:cs="Courier New"/>
@@ -15390,6 +15938,7 @@
         <w:t xml:space="preserve"> "RESIGN"          -&gt; </w:t>
       </w:r>
       <w:proofErr w:type="spellStart"/>
+      <w:proofErr w:type="gramStart"/>
       <w:r>
         <w:rPr>
           <w:rFonts w:ascii="Courier New" w:hAnsi="Courier New" w:cs="Courier New"/>
@@ -15408,6 +15957,7 @@
         <w:t>(</w:t>
       </w:r>
       <w:proofErr w:type="spellStart"/>
+      <w:proofErr w:type="gramEnd"/>
       <w:r>
         <w:rPr>
           <w:rFonts w:ascii="Courier New" w:hAnsi="Courier New" w:cs="Courier New"/>
@@ -15480,6 +16030,7 @@
         <w:t xml:space="preserve"> -&gt; </w:t>
       </w:r>
       <w:proofErr w:type="spellStart"/>
+      <w:proofErr w:type="gramStart"/>
       <w:r>
         <w:rPr>
           <w:rFonts w:ascii="Courier New" w:hAnsi="Courier New" w:cs="Courier New"/>
@@ -15498,6 +16049,7 @@
         <w:t>(</w:t>
       </w:r>
       <w:proofErr w:type="spellStart"/>
+      <w:proofErr w:type="gramEnd"/>
       <w:r>
         <w:rPr>
           <w:rFonts w:ascii="Courier New" w:hAnsi="Courier New" w:cs="Courier New"/>
@@ -15516,6 +16068,7 @@
         <w:t xml:space="preserve">, "Неизвестный тип сообщения: " + </w:t>
       </w:r>
       <w:proofErr w:type="spellStart"/>
+      <w:proofErr w:type="gramStart"/>
       <w:r>
         <w:rPr>
           <w:rFonts w:ascii="Courier New" w:hAnsi="Courier New" w:cs="Courier New"/>
@@ -15525,6 +16078,7 @@
         <w:t>msg.getType</w:t>
       </w:r>
       <w:proofErr w:type="spellEnd"/>
+      <w:proofErr w:type="gramEnd"/>
       <w:r>
         <w:rPr>
           <w:rFonts w:ascii="Courier New" w:hAnsi="Courier New" w:cs="Courier New"/>
@@ -15670,6 +16224,7 @@
         <w:t xml:space="preserve"> </w:t>
       </w:r>
       <w:proofErr w:type="spellStart"/>
+      <w:proofErr w:type="gramStart"/>
       <w:r>
         <w:rPr>
           <w:rFonts w:ascii="Courier New" w:hAnsi="Courier New" w:cs="Courier New"/>
@@ -15688,6 +16243,7 @@
         <w:t>(</w:t>
       </w:r>
       <w:proofErr w:type="spellStart"/>
+      <w:proofErr w:type="gramEnd"/>
       <w:r>
         <w:rPr>
           <w:rFonts w:ascii="Courier New" w:hAnsi="Courier New" w:cs="Courier New"/>
@@ -15896,6 +16452,7 @@
         <w:t xml:space="preserve"> </w:t>
       </w:r>
       <w:proofErr w:type="spellStart"/>
+      <w:proofErr w:type="gramStart"/>
       <w:r>
         <w:rPr>
           <w:rFonts w:ascii="Courier New" w:hAnsi="Courier New" w:cs="Courier New"/>
@@ -15914,6 +16471,7 @@
         <w:t>(</w:t>
       </w:r>
       <w:proofErr w:type="spellStart"/>
+      <w:proofErr w:type="gramEnd"/>
       <w:r>
         <w:rPr>
           <w:rFonts w:ascii="Courier New" w:hAnsi="Courier New" w:cs="Courier New"/>
@@ -16104,6 +16662,7 @@
         <w:t xml:space="preserve"> </w:t>
       </w:r>
       <w:proofErr w:type="spellStart"/>
+      <w:proofErr w:type="gramStart"/>
       <w:r>
         <w:rPr>
           <w:rFonts w:ascii="Courier New" w:hAnsi="Courier New" w:cs="Courier New"/>
@@ -16122,6 +16681,7 @@
         <w:t>(</w:t>
       </w:r>
       <w:proofErr w:type="spellStart"/>
+      <w:proofErr w:type="gramEnd"/>
       <w:r>
         <w:rPr>
           <w:rFonts w:ascii="Courier New" w:hAnsi="Courier New" w:cs="Courier New"/>
@@ -16312,6 +16872,7 @@
         <w:t xml:space="preserve"> </w:t>
       </w:r>
       <w:proofErr w:type="spellStart"/>
+      <w:proofErr w:type="gramStart"/>
       <w:r>
         <w:rPr>
           <w:rFonts w:ascii="Courier New" w:hAnsi="Courier New" w:cs="Courier New"/>
@@ -16330,6 +16891,7 @@
         <w:t>(</w:t>
       </w:r>
       <w:proofErr w:type="spellStart"/>
+      <w:proofErr w:type="gramEnd"/>
       <w:r>
         <w:rPr>
           <w:rFonts w:ascii="Courier New" w:hAnsi="Courier New" w:cs="Courier New"/>
@@ -16520,6 +17082,7 @@
         <w:t xml:space="preserve"> </w:t>
       </w:r>
       <w:proofErr w:type="spellStart"/>
+      <w:proofErr w:type="gramStart"/>
       <w:r>
         <w:rPr>
           <w:rFonts w:ascii="Courier New" w:hAnsi="Courier New" w:cs="Courier New"/>
@@ -16538,6 +17101,7 @@
         <w:t>(</w:t>
       </w:r>
       <w:proofErr w:type="spellStart"/>
+      <w:proofErr w:type="gramEnd"/>
       <w:r>
         <w:rPr>
           <w:rFonts w:ascii="Courier New" w:hAnsi="Courier New" w:cs="Courier New"/>
@@ -16729,6 +17293,7 @@
         <w:t xml:space="preserve"> </w:t>
       </w:r>
       <w:proofErr w:type="spellStart"/>
+      <w:proofErr w:type="gramStart"/>
       <w:r>
         <w:rPr>
           <w:rFonts w:ascii="Courier New" w:hAnsi="Courier New" w:cs="Courier New"/>
@@ -16747,6 +17312,7 @@
         <w:t>(</w:t>
       </w:r>
       <w:proofErr w:type="spellStart"/>
+      <w:proofErr w:type="gramEnd"/>
       <w:r>
         <w:rPr>
           <w:rFonts w:ascii="Courier New" w:hAnsi="Courier New" w:cs="Courier New"/>
@@ -16937,6 +17503,7 @@
         <w:t xml:space="preserve"> </w:t>
       </w:r>
       <w:proofErr w:type="spellStart"/>
+      <w:proofErr w:type="gramStart"/>
       <w:r>
         <w:rPr>
           <w:rFonts w:ascii="Courier New" w:hAnsi="Courier New" w:cs="Courier New"/>
@@ -16952,7 +17519,16 @@
           <w:sz w:val="24"/>
           <w:szCs w:val="24"/>
         </w:rPr>
-        <w:t xml:space="preserve">(Game </w:t>
+        <w:t>(</w:t>
+      </w:r>
+      <w:proofErr w:type="gramEnd"/>
+      <w:r>
+        <w:rPr>
+          <w:rFonts w:ascii="Courier New" w:hAnsi="Courier New" w:cs="Courier New"/>
+          <w:sz w:val="24"/>
+          <w:szCs w:val="24"/>
+        </w:rPr>
+        <w:t xml:space="preserve">Game </w:t>
       </w:r>
       <w:proofErr w:type="spellStart"/>
       <w:r>
@@ -17091,6 +17667,7 @@
         <w:t xml:space="preserve"> </w:t>
       </w:r>
       <w:proofErr w:type="spellStart"/>
+      <w:proofErr w:type="gramStart"/>
       <w:r>
         <w:rPr>
           <w:rFonts w:ascii="Courier New" w:hAnsi="Courier New" w:cs="Courier New"/>
@@ -17106,7 +17683,16 @@
           <w:sz w:val="24"/>
           <w:szCs w:val="24"/>
         </w:rPr>
-        <w:t xml:space="preserve">(Game </w:t>
+        <w:t>(</w:t>
+      </w:r>
+      <w:proofErr w:type="gramEnd"/>
+      <w:r>
+        <w:rPr>
+          <w:rFonts w:ascii="Courier New" w:hAnsi="Courier New" w:cs="Courier New"/>
+          <w:sz w:val="24"/>
+          <w:szCs w:val="24"/>
+        </w:rPr>
+        <w:t xml:space="preserve">Game </w:t>
       </w:r>
       <w:proofErr w:type="spellStart"/>
       <w:r>
@@ -17281,6 +17867,7 @@
         <w:t xml:space="preserve"> </w:t>
       </w:r>
       <w:proofErr w:type="spellStart"/>
+      <w:proofErr w:type="gramStart"/>
       <w:r>
         <w:rPr>
           <w:rFonts w:ascii="Courier New" w:hAnsi="Courier New" w:cs="Courier New"/>
@@ -17299,6 +17886,7 @@
         <w:t>(</w:t>
       </w:r>
       <w:proofErr w:type="spellStart"/>
+      <w:proofErr w:type="gramEnd"/>
       <w:r>
         <w:rPr>
           <w:rFonts w:ascii="Courier New" w:hAnsi="Courier New" w:cs="Courier New"/>
@@ -17368,9 +17956,19 @@
           <w:sz w:val="24"/>
           <w:szCs w:val="24"/>
         </w:rPr>
-        <w:t>, List&lt;</w:t>
-      </w:r>
-      <w:proofErr w:type="spellStart"/>
+        <w:t xml:space="preserve">, </w:t>
+      </w:r>
+      <w:proofErr w:type="gramStart"/>
+      <w:r>
+        <w:rPr>
+          <w:rFonts w:ascii="Courier New" w:hAnsi="Courier New" w:cs="Courier New"/>
+          <w:sz w:val="24"/>
+          <w:szCs w:val="24"/>
+        </w:rPr>
+        <w:t>List&lt;</w:t>
+      </w:r>
+      <w:proofErr w:type="spellStart"/>
+      <w:proofErr w:type="gramEnd"/>
       <w:r>
         <w:rPr>
           <w:rFonts w:ascii="Courier New" w:hAnsi="Courier New" w:cs="Courier New"/>
@@ -17404,9 +18002,19 @@
           <w:sz w:val="24"/>
           <w:szCs w:val="24"/>
         </w:rPr>
-        <w:t>, List&lt;</w:t>
-      </w:r>
-      <w:proofErr w:type="spellStart"/>
+        <w:t xml:space="preserve">, </w:t>
+      </w:r>
+      <w:proofErr w:type="gramStart"/>
+      <w:r>
+        <w:rPr>
+          <w:rFonts w:ascii="Courier New" w:hAnsi="Courier New" w:cs="Courier New"/>
+          <w:sz w:val="24"/>
+          <w:szCs w:val="24"/>
+        </w:rPr>
+        <w:t>List&lt;</w:t>
+      </w:r>
+      <w:proofErr w:type="spellStart"/>
+      <w:proofErr w:type="gramEnd"/>
       <w:r>
         <w:rPr>
           <w:rFonts w:ascii="Courier New" w:hAnsi="Courier New" w:cs="Courier New"/>
@@ -17648,7 +18256,25 @@
           <w:sz w:val="24"/>
           <w:szCs w:val="24"/>
         </w:rPr>
-        <w:t xml:space="preserve">    @Scheduled(fixedDelay = 30_000)</w:t>
+        <w:t xml:space="preserve">    @</w:t>
+      </w:r>
+      <w:proofErr w:type="gramStart"/>
+      <w:r>
+        <w:rPr>
+          <w:rFonts w:ascii="Courier New" w:hAnsi="Courier New" w:cs="Courier New"/>
+          <w:sz w:val="24"/>
+          <w:szCs w:val="24"/>
+        </w:rPr>
+        <w:t>Scheduled(</w:t>
+      </w:r>
+      <w:proofErr w:type="gramEnd"/>
+      <w:r>
+        <w:rPr>
+          <w:rFonts w:ascii="Courier New" w:hAnsi="Courier New" w:cs="Courier New"/>
+          <w:sz w:val="24"/>
+          <w:szCs w:val="24"/>
+        </w:rPr>
+        <w:t>fixedDelay = 30_000)</w:t>
       </w:r>
     </w:p>
     <w:p>
@@ -17705,6 +18331,7 @@
         <w:t xml:space="preserve"> </w:t>
       </w:r>
       <w:proofErr w:type="spellStart"/>
+      <w:proofErr w:type="gramStart"/>
       <w:r>
         <w:rPr>
           <w:rFonts w:ascii="Courier New" w:hAnsi="Courier New" w:cs="Courier New"/>
@@ -17720,7 +18347,16 @@
           <w:sz w:val="24"/>
           <w:szCs w:val="24"/>
         </w:rPr>
-        <w:t>() {}</w:t>
+        <w:t>(</w:t>
+      </w:r>
+      <w:proofErr w:type="gramEnd"/>
+      <w:r>
+        <w:rPr>
+          <w:rFonts w:ascii="Courier New" w:hAnsi="Courier New" w:cs="Courier New"/>
+          <w:sz w:val="24"/>
+          <w:szCs w:val="24"/>
+        </w:rPr>
+        <w:t>) {}</w:t>
       </w:r>
     </w:p>
     <w:p>
@@ -17806,6 +18442,7 @@
         <w:t xml:space="preserve"> </w:t>
       </w:r>
       <w:proofErr w:type="spellStart"/>
+      <w:proofErr w:type="gramStart"/>
       <w:r>
         <w:rPr>
           <w:rFonts w:ascii="Courier New" w:hAnsi="Courier New" w:cs="Courier New"/>
@@ -17824,6 +18461,7 @@
         <w:t>(</w:t>
       </w:r>
       <w:proofErr w:type="spellStart"/>
+      <w:proofErr w:type="gramEnd"/>
       <w:r>
         <w:rPr>
           <w:rFonts w:ascii="Courier New" w:hAnsi="Courier New" w:cs="Courier New"/>
@@ -25177,7 +25815,7 @@
       </w:pPr>
     </w:p>
     <w:sectPr>
-      <w:headerReference w:type="default" r:id="rId32"/>
+      <w:headerReference w:type="default" r:id="rId35"/>
       <w:pgSz w:w="11906" w:h="16838"/>
       <w:pgMar w:top="1134" w:right="851" w:bottom="1134" w:left="1701" w:header="708" w:footer="708" w:gutter="0"/>
       <w:cols w:space="720"/>
@@ -25910,6 +26548,7 @@
   <w:style w:type="paragraph" w:default="1" w:styleId="a">
     <w:name w:val="Normal"/>
     <w:qFormat/>
+    <w:rsid w:val="006710F4"/>
   </w:style>
   <w:style w:type="paragraph" w:styleId="1">
     <w:name w:val="heading 1"/>

</xml_diff>